<commit_message>
updated design 3 turnin
</commit_message>
<xml_diff>
--- a/docs/projects/design3-turnin.docx
+++ b/docs/projects/design3-turnin.docx
@@ -23,7 +23,7 @@
         <w:pStyle w:val="Date"/>
       </w:pPr>
       <w:r>
-        <w:t xml:space="preserve">2023-11-17</w:t>
+        <w:t xml:space="preserve">2025-11-25</w:t>
       </w:r>
     </w:p>
     <w:bookmarkStart w:id="33" w:name="turn-in-your-design-3"/>
@@ -96,7 +96,7 @@
         </w:numPr>
       </w:pPr>
       <w:r>
-        <w:t xml:space="preserve">Post your draft paper on the shared Google Drive by midnight Monday. [</w:t>
+        <w:t xml:space="preserve">Post your draft paper on the shared Google Drive by midnight Wednesday. [</w:t>
       </w:r>
       <w:hyperlink r:id="rId20">
         <w:r>
@@ -310,6 +310,31 @@
           </w:p>
           <w:p>
             <w:pPr>
+              <w:pStyle w:val="Compact"/>
+              <w:numPr>
+                <w:ilvl w:val="0"/>
+                <w:numId w:val="1003"/>
+              </w:numPr>
+            </w:pPr>
+            <w:r>
+              <w:t xml:space="preserve">Submit by email to the two authors with a cc to me by</w:t>
+            </w:r>
+            <w:r>
+              <w:t xml:space="preserve"> </w:t>
+            </w:r>
+            <w:r>
+              <w:rPr>
+                <w:b/>
+                <w:bCs/>
+              </w:rPr>
+              <w:t xml:space="preserve">Friday</w:t>
+            </w:r>
+            <w:r>
+              <w:t xml:space="preserve">.</w:t>
+            </w:r>
+          </w:p>
+          <w:p>
+            <w:pPr>
               <w:pStyle w:val="FirstParagraph"/>
             </w:pPr>
             <w:pPr>
@@ -542,7 +567,7 @@
       </w:r>
     </w:p>
     <w:bookmarkEnd w:id="28"/>
-    <w:bookmarkStart w:id="29" w:name="X4e24c2da1e01b17c50192787a333f60678d8f35"/>
+    <w:bookmarkStart w:id="29" w:name="X8cbc355a70bb98d6c1cf44e0b9d043365c35c37"/>
     <w:p>
       <w:pPr>
         <w:pStyle w:val="Heading3"/>
@@ -585,7 +610,7 @@
         <w:t xml:space="preserve">for the authors</w:t>
       </w:r>
       <w:r>
-        <w:t xml:space="preserve">. Please submit by Wednesday.</w:t>
+        <w:t xml:space="preserve">. Please submit by Friday.</w:t>
       </w:r>
     </w:p>
     <w:p>

</xml_diff>